<commit_message>
docs: rework OKRIM info - unified text without sections, add letters annex and annotated copy
Co-authored-by: arena-agent <297053741+arena-agent@users.noreply.github.com>
</commit_message>
<xml_diff>
--- a/154/эксперизы/Информация_ОКРИМ_для_КСО.docx
+++ b/154/эксперизы/Информация_ОКРИМ_для_КСО.docx
@@ -11,7 +11,7 @@
       <w:r>
         <w:rPr>
           <w:rFonts w:ascii="Times New Roman" w:hAnsi="Times New Roman" w:eastAsia="Times New Roman"/>
-          <w:b/>
+          <w:b w:val="0"/>
           <w:sz w:val="28"/>
         </w:rPr>
         <w:t>Информация отдела криминалистики следственного управления</w:t>
@@ -56,10 +56,10 @@
       <w:r>
         <w:rPr>
           <w:rFonts w:ascii="Times New Roman" w:hAnsi="Times New Roman" w:eastAsia="Times New Roman"/>
-          <w:b/>
+          <w:b w:val="0"/>
           <w:sz w:val="28"/>
         </w:rPr>
-        <w:t>1. О действующем порядке продления процессуальных сроков по уголовным делам, находящимся на контроле отдела криминалистики.</w:t>
+        <w:t>Порядок продления процессуальных сроков по уголовным делам, находящимся на контроле отдела криминалистики, определен приказом руководителя следственного управления от 07.12.2023 № 154 (с изменениями, внесенными приказом от 20.12.2023 № 160). По уголовным делам по фактам безвестного исчезновения граждан и обнаружения неопознанных трупов, о преступлениях, предусмотренных ст. 105, 111, 126, 131–135 УК РФ, совершенных в условиях неочевидности, а также о преступлениях прошлых лет постановления о возбуждении ходатайств о продлении срока предварительного следствия свыше 3 месяцев и срока содержания обвиняемых под стражей свыше 6 месяцев представляются с уголовным делом в отдел криминалистики не позднее 15 суток до истечения установленного ранее срока.</w:t>
       </w:r>
     </w:p>
     <w:p>
@@ -74,22 +74,7 @@
           <w:b w:val="0"/>
           <w:sz w:val="28"/>
         </w:rPr>
-        <w:t>Порядок продления процессуальных сроков определен приказом руководителя следственного управления от 07.12.2023 № 154 (с изменениями, внесенными приказом от 20.12.2023 № 160). По уголовным делам о преступлениях, по фактам безвестного исчезновения граждан и обнаружения неопознанных трупов, о преступлениях, предусмотренных ст. 105, 111, 126, 131–135 УК РФ, совершенных в условиях неочевидности, а также о преступлениях прошлых лет (далее – по направлениям деятельности отдела криминалистики) постановления о возбуждении ходатайств о продлении срока предварительного следствия свыше 3 месяцев и срока содержания обвиняемых под стражей свыше 6 месяцев представляются с уголовным делом в отдел криминалистики не позднее 15 суток до истечения установленного ранее срока.</w:t>
-      </w:r>
-    </w:p>
-    <w:p>
-      <w:pPr>
-        <w:spacing w:before="0" w:after="0" w:line="240" w:lineRule="auto"/>
-        <w:ind w:firstLine="709"/>
-        <w:jc w:val="both"/>
-      </w:pPr>
-      <w:r>
-        <w:rPr>
-          <w:rFonts w:ascii="Times New Roman" w:hAnsi="Times New Roman" w:eastAsia="Times New Roman"/>
-          <w:b w:val="0"/>
-          <w:sz w:val="28"/>
-        </w:rPr>
-        <w:t>Уголовные дела с постановлениями о возбуждении ходатайств о продлении изучаются отделом криминалистики в течение 7 суток с обязательным составлением заключения о законности и обоснованности возбуждения ходатайства; при необходимости даются письменные указания о производстве конкретных следственных действий в установленный срок предварительного следствия с контролем их исполнения. При обращении с ходатайством о продлении срока свыше 3 месяцев организуется заслушивание хода расследования на оперативных совещаниях при курирующем заместителе руководителя следственного управления; при продлении свыше 6 месяцев дается оценка интенсивности расследования, полноте, качеству и своевременности производства следственных действий, намеченных планами расследования и ранее данными указаниями.</w:t>
+        <w:t>Уголовные дела с постановлениями о возбуждении ходатайств о продлении изучаются отделом криминалистики в течение 7 суток с обязательным составлением заключения о законности и обоснованности возбуждения ходатайства; при необходимости даются письменные указания о производстве конкретных следственных действий в установленный срок предварительного следствия с контролем их исполнения. При обращении с ходатайством о продлении срока свыше 3 месяцев организуется заслушивание хода расследования на оперативных совещаниях при курирующем заместителе руководителя следственного управления; при продлении свыше 6 месяцев дается оценка интенсивности расследования, полноте, качеству и своевременности производства следственных действий, намеченных планами расследования и ранее данными указаниями. Продление процессуальных сроков по указанной категории уголовных дел осуществляется заместителем руководителя следственного управления, курирующим отдел криминалистики, с учетом заключения отдела.</w:t>
       </w:r>
     </w:p>
     <w:p>
@@ -119,22 +104,7 @@
           <w:b w:val="0"/>
           <w:sz w:val="28"/>
         </w:rPr>
-        <w:t>Продление процессуальных сроков по указанной категории уголовных дел осуществляется заместителем руководителя следственного управления, курирующим отдел криминалистики, с учетом заключения отдела.</w:t>
-      </w:r>
-    </w:p>
-    <w:p>
-      <w:pPr>
-        <w:spacing w:before="0" w:after="0" w:line="240" w:lineRule="auto"/>
-        <w:ind w:firstLine="709"/>
-        <w:jc w:val="both"/>
-      </w:pPr>
-      <w:r>
-        <w:rPr>
-          <w:rFonts w:ascii="Times New Roman" w:hAnsi="Times New Roman" w:eastAsia="Times New Roman"/>
-          <w:b/>
-          <w:sz w:val="28"/>
-        </w:rPr>
-        <w:t>2. О порядке изучения уголовных дел отделом криминалистики.</w:t>
+        <w:t>Порядок изучения уголовных дел построен следующим образом. Уголовные дела, отнесенные к направлениям деятельности отдела криминалистики, изучаются в течение 10 суток с момента возбуждения уголовного дела или возобновления производства по нему на предмет выполнения следственных и процессуальных действий, направленных на раскрытие преступления, обеспечения полного и всестороннего расследования и проверки исполнения данных указаний; по результатам изучения составляется справка. Отделом криминалистики изучаются уголовные дела всех категорий, поступающие с проектами постановлений о приостановлении предварительного следствия по п. 1 ч. 1 ст. 208 УПК РФ, а также уголовные дела указанных направлений, поступающие с проектами постановлений о прекращении уголовного дела (преследования) и о приостановлении предварительного следствия по иным основаниям. По уголовным делам, возвращенным прокурором или руководителем следственного органа, организуется заслушивание руководителя следственного отдела совместно со следователем при курирующем заместителе руководителя следственного управления. В соответствии с требованиями п. 1 ч. 2 ст. 209 УПК РФ организуется планомерная ежемесячная работа следователей по приостановленным уголовным делам, контроль за которой осуществляет отдел криминалистики; работа по раскрытию преступлений прошлых лет ежеквартально анализируется и докладывается руководителю следственного управления.</w:t>
       </w:r>
     </w:p>
     <w:p>
@@ -149,112 +119,7 @@
           <w:b w:val="0"/>
           <w:sz w:val="28"/>
         </w:rPr>
-        <w:t>Уголовные дела, отнесенные к направлениям деятельности отдела криминалистики, изучаются в течение 10 суток с момента возбуждения уголовного дела или возобновления производства по нему на предмет выполнения следственных и процессуальных действий, направленных на раскрытие преступления, обеспечения полного и всестороннего расследования и проверки исполнения данных указаний. По результатам изучения составляется справка.</w:t>
-      </w:r>
-    </w:p>
-    <w:p>
-      <w:pPr>
-        <w:spacing w:before="0" w:after="0" w:line="240" w:lineRule="auto"/>
-        <w:ind w:firstLine="709"/>
-        <w:jc w:val="both"/>
-      </w:pPr>
-      <w:r>
-        <w:rPr>
-          <w:rFonts w:ascii="Times New Roman" w:hAnsi="Times New Roman" w:eastAsia="Times New Roman"/>
-          <w:b w:val="0"/>
-          <w:sz w:val="28"/>
-        </w:rPr>
-        <w:t>Отделом криминалистики изучаются уголовные дела всех категорий, поступающие с проектами постановлений о приостановлении предварительного следствия по п. 1 ч. 1 ст. 208 УПК РФ, а также уголовные дела направлений деятельности отдела, поступающие с проектами постановлений о прекращении уголовного дела (преследования) и о приостановлении предварительного следствия по иным основаниям. По уголовным делам, возвращенным прокурором или руководителем следственного органа, организуется заслушивание руководителя следственного отдела совместно со следователем при курирующем заместителе руководителя следственного управления.</w:t>
-      </w:r>
-    </w:p>
-    <w:p>
-      <w:pPr>
-        <w:spacing w:before="0" w:after="0" w:line="240" w:lineRule="auto"/>
-        <w:ind w:firstLine="709"/>
-        <w:jc w:val="both"/>
-      </w:pPr>
-      <w:r>
-        <w:rPr>
-          <w:rFonts w:ascii="Times New Roman" w:hAnsi="Times New Roman" w:eastAsia="Times New Roman"/>
-          <w:b w:val="0"/>
-          <w:sz w:val="28"/>
-        </w:rPr>
-        <w:t>Кроме того, в соответствии с требованиями п. 1 ч. 2 ст. 209 УПК РФ организуется планомерная ежемесячная работа следователей по приостановленным уголовным делам, контроль за которой осуществляет отдел криминалистики; работа по раскрытию преступлений прошлых лет ежеквартально анализируется и докладывается руководителю следственного управления.</w:t>
-      </w:r>
-    </w:p>
-    <w:p>
-      <w:pPr>
-        <w:spacing w:before="0" w:after="0" w:line="240" w:lineRule="auto"/>
-        <w:ind w:firstLine="709"/>
-        <w:jc w:val="both"/>
-      </w:pPr>
-      <w:r>
-        <w:rPr>
-          <w:rFonts w:ascii="Times New Roman" w:hAnsi="Times New Roman" w:eastAsia="Times New Roman"/>
-          <w:b/>
-          <w:sz w:val="28"/>
-        </w:rPr>
-        <w:t>3. О механизме проверки своевременности назначения судебных экспертиз и полноты поставленных вопросов.</w:t>
-      </w:r>
-    </w:p>
-    <w:p>
-      <w:pPr>
-        <w:spacing w:before="0" w:after="0" w:line="240" w:lineRule="auto"/>
-        <w:ind w:firstLine="709"/>
-        <w:jc w:val="both"/>
-      </w:pPr>
-      <w:r>
-        <w:rPr>
-          <w:rFonts w:ascii="Times New Roman" w:hAnsi="Times New Roman" w:eastAsia="Times New Roman"/>
-          <w:b w:val="0"/>
-          <w:sz w:val="28"/>
-        </w:rPr>
-        <w:t>Отдельный механизм проверки своевременности назначения судебных экспертиз и полноты поставленных перед экспертами вопросов в следственном управлении имеется и реализуется в следующих формах.</w:t>
-      </w:r>
-    </w:p>
-    <w:p>
-      <w:pPr>
-        <w:spacing w:before="0" w:after="0" w:line="240" w:lineRule="auto"/>
-        <w:ind w:firstLine="709"/>
-        <w:jc w:val="both"/>
-      </w:pPr>
-      <w:r>
-        <w:rPr>
-          <w:rFonts w:ascii="Times New Roman" w:hAnsi="Times New Roman" w:eastAsia="Times New Roman"/>
-          <w:b w:val="0"/>
-          <w:sz w:val="28"/>
-        </w:rPr>
-        <w:t>Во-первых, на постоянной основе ведется учет назначаемых в следственных отделах судебных экспертиз, контроль за своевременностью предоставления следователями экспертам необходимых для исследования материалов, сроков производства экспертиз и получения их результатов; заключения экспертов изучаются во взаимосвязи с установленными обстоятельствами происшествия.</w:t>
-      </w:r>
-    </w:p>
-    <w:p>
-      <w:pPr>
-        <w:spacing w:before="0" w:after="0" w:line="240" w:lineRule="auto"/>
-        <w:ind w:firstLine="709"/>
-        <w:jc w:val="both"/>
-      </w:pPr>
-      <w:r>
-        <w:rPr>
-          <w:rFonts w:ascii="Times New Roman" w:hAnsi="Times New Roman" w:eastAsia="Times New Roman"/>
-          <w:b w:val="0"/>
-          <w:sz w:val="28"/>
-        </w:rPr>
-        <w:t>Во-вторых, при вынесении следователями ходатайств о продлении срока предварительного расследования в связи с производством судебной экспертизы уголовное дело в обязательном порядке изучается отделом криминалистики на предмет своевременности назначения экспертизы, полноты поставленных вопросов и представленных объектов исследования.</w:t>
-      </w:r>
-    </w:p>
-    <w:p>
-      <w:pPr>
-        <w:spacing w:before="0" w:after="0" w:line="240" w:lineRule="auto"/>
-        <w:ind w:firstLine="709"/>
-        <w:jc w:val="both"/>
-      </w:pPr>
-      <w:r>
-        <w:rPr>
-          <w:rFonts w:ascii="Times New Roman" w:hAnsi="Times New Roman" w:eastAsia="Times New Roman"/>
-          <w:b w:val="0"/>
-          <w:sz w:val="28"/>
-        </w:rPr>
-        <w:t>В-третьих, назначение платных судебных экспертиз осуществляется исключительно после согласования с отделом криминалистики в порядке, установленном приказом руководителя следственного управления от 29.05.2025 № 58 «Об организации назначения платных судебных экспертиз»: с направлением запросов о возможности производства экспертизы в государственные экспертные учреждения, получением коммерческих предложений, проверкой профессиональной компетенции экспертов, проверкой полноты и обоснованности пакета документов и состава экспертных учреждений.</w:t>
+        <w:t>Отдельный механизм проверки своевременности назначения судебных экспертиз и полноты поставленных перед экспертами вопросов в следственном управлении имеется и реализуется в следующих формах. На постоянной основе ведется учет назначаемых в следственных отделах судебных экспертиз, контроль за своевременностью предоставления следователями экспертам необходимых для исследования материалов, сроков производства экспертиз и получения их результатов; заключения экспертов изучаются во взаимосвязи с установленными обстоятельствами происшествия. При вынесении следователями ходатайств о продлении срока предварительного расследования в связи с производством судебной экспертизы уголовное дело в обязательном порядке изучается отделом криминалистики на предмет своевременности назначения экспертизы, полноты поставленных вопросов и представленных объектов исследования. Назначение платных судебных экспертиз осуществляется исключительно после согласования с отделом криминалистики в порядке, установленном приказом руководителя следственного управления от 29.05.2025 № 58 «Об организации назначения платных судебных экспертиз», с направлением запросов о возможности производства экспертизы в государственные экспертные учреждения, получением коммерческих предложений, проверкой профессиональной компетенции экспертов, полноты и обоснованности пакета документов.</w:t>
       </w:r>
     </w:p>
     <w:p>
@@ -281,10 +146,10 @@
       <w:r>
         <w:rPr>
           <w:rFonts w:ascii="Times New Roman" w:hAnsi="Times New Roman" w:eastAsia="Times New Roman"/>
-          <w:b/>
+          <w:b w:val="0"/>
           <w:sz w:val="28"/>
         </w:rPr>
-        <w:t>4. О причинах продления процессуальных сроков, связанных с производством судебных экспертиз (для формирования таблицы 1).</w:t>
+        <w:t>Значительная часть продлений процессуальных сроков по уголовным делам, находящимся на контроле отдела криминалистики, объективно обусловлена длительным производством судебных экспертиз, прежде всего комплексных, комиссионных и налоговых. Так, в Южный филиал СЭЦ СК России за истекший период 2026 года назначено 43 судебные налоговые экспертизы, из которых завершено 18, 25 остаются в производстве; определить сроки их завершения не представляется возможным ввиду изменяющегося порядка производства экспертных исследований в соответствии с поступающими указаниями центрального аппарата СЭЦ СК России о внеочередном производстве отдельных экспертных исследований. Указанные обстоятельства не зависят от следствия. При этом сроки назначения и производства большинства видов судебных экспертиз соответствуют потребностям следственных органов и по отдельным видам экспертиз сократились в сравнении с предшествующими периодами, что стало возможным в результате межведомственного взаимодействия и принятых экспертными учреждениями организационных мер. По результатам изучения уголовных дел при продлении сроков отделом криминалистики выявлялись и случаи несвоевременного назначения экспертиз, по каждому из которых давались письменные указания; информация о них может быть представлена дополнительно при формировании показателей о причинах продления, зависящих от следствия.</w:t>
       </w:r>
     </w:p>
     <w:p>
@@ -299,97 +164,7 @@
           <w:b w:val="0"/>
           <w:sz w:val="28"/>
         </w:rPr>
-        <w:t>Значительная часть продлений процессуальных сроков по уголовным делам, находящимся на контроле отдела криминалистики, объективно обусловлена длительным производством судебных экспертиз, прежде всего комплексных, комиссионных и налоговых. Так, в Южный филиал СЭЦ СК России за истекший период 2026 года назначено 43 судебные налоговые экспертизы, из которых завершено 18, 25 остаются в производстве; определить сроки их завершения не представляется возможным ввиду изменяющегося порядка производства экспертных исследований в соответствии с поступающими указаниями центрального аппарата СЭЦ СК России о внеочередном производстве отдельных экспертных исследований. Указанные обстоятельства находятся вне зависимости от следствия и следственных органов.</w:t>
-      </w:r>
-    </w:p>
-    <w:p>
-      <w:pPr>
-        <w:spacing w:before="0" w:after="0" w:line="240" w:lineRule="auto"/>
-        <w:ind w:firstLine="709"/>
-        <w:jc w:val="both"/>
-      </w:pPr>
-      <w:r>
-        <w:rPr>
-          <w:rFonts w:ascii="Times New Roman" w:hAnsi="Times New Roman" w:eastAsia="Times New Roman"/>
-          <w:b w:val="0"/>
-          <w:sz w:val="28"/>
-        </w:rPr>
-        <w:t>При этом сроки назначения и производства большинства видов судебных экспертиз соответствуют потребностям следственных органов и по отдельным видам экспертиз сократились в сравнении с предшествующими периодами, что стало возможным в результате межведомственного взаимодействия и принятых экспертными учреждениями организационных мер.</w:t>
-      </w:r>
-    </w:p>
-    <w:p>
-      <w:pPr>
-        <w:spacing w:before="0" w:after="0" w:line="240" w:lineRule="auto"/>
-        <w:ind w:firstLine="709"/>
-        <w:jc w:val="both"/>
-      </w:pPr>
-      <w:r>
-        <w:rPr>
-          <w:rFonts w:ascii="Times New Roman" w:hAnsi="Times New Roman" w:eastAsia="Times New Roman"/>
-          <w:b w:val="0"/>
-          <w:sz w:val="28"/>
-        </w:rPr>
-        <w:t>По результатам изучения уголовных дел при продлении сроков отделом криминалистики выявлялись и случаи несвоевременного назначения экспертиз, по каждому из которых давались письменные указания, информация о которых может быть представлена дополнительно при формировании граф таблиц, отражающих причины, зависящие от следствия (в том числе выявленную волокиту).</w:t>
-      </w:r>
-    </w:p>
-    <w:p>
-      <w:pPr>
-        <w:spacing w:before="0" w:after="0" w:line="240" w:lineRule="auto"/>
-        <w:ind w:firstLine="709"/>
-        <w:jc w:val="both"/>
-      </w:pPr>
-      <w:r>
-        <w:rPr>
-          <w:rFonts w:ascii="Times New Roman" w:hAnsi="Times New Roman" w:eastAsia="Times New Roman"/>
-          <w:b/>
-          <w:sz w:val="28"/>
-        </w:rPr>
-        <w:t>5. О мерах, принятых в части компетенции отдела криминалистики, направленных на недопущение нарушения сроков предварительного следствия.</w:t>
-      </w:r>
-    </w:p>
-    <w:p>
-      <w:pPr>
-        <w:spacing w:before="0" w:after="0" w:line="240" w:lineRule="auto"/>
-        <w:ind w:firstLine="709"/>
-        <w:jc w:val="both"/>
-      </w:pPr>
-      <w:r>
-        <w:rPr>
-          <w:rFonts w:ascii="Times New Roman" w:hAnsi="Times New Roman" w:eastAsia="Times New Roman"/>
-          <w:b w:val="0"/>
-          <w:sz w:val="28"/>
-        </w:rPr>
-        <w:t>Руководители следственных отделов ориентированы на неукоснительное соблюдение требований ст. 6.1 УПК РФ, незамедлительное назначение всех необходимых судебных экспертиз и производство следственных и процессуальных действий, направленных на скорейшее принятие законного и обоснованного решения.</w:t>
-      </w:r>
-    </w:p>
-    <w:p>
-      <w:pPr>
-        <w:spacing w:before="0" w:after="0" w:line="240" w:lineRule="auto"/>
-        <w:ind w:firstLine="709"/>
-        <w:jc w:val="both"/>
-      </w:pPr>
-      <w:r>
-        <w:rPr>
-          <w:rFonts w:ascii="Times New Roman" w:hAnsi="Times New Roman" w:eastAsia="Times New Roman"/>
-          <w:b w:val="0"/>
-          <w:sz w:val="28"/>
-        </w:rPr>
-        <w:t>В рамках криминалистического сопровождения расследования на первоначальном этапе обсуждается объем необходимых экспертных исследований и конкретные экспертные учреждения; по результатам изучения уголовных дел даются письменные указания в порядке ст. 39 УПК РФ, составляются дополнительные согласованные планы следственных действий и оперативно-розыскных мероприятий, направленные на установление лиц, подлежащих привлечению в качестве обвиняемых. На межведомственных совещаниях при участии органов дознания за истекший период заслушано 29 уголовных дел, по которым даны указания, исполнение которых контролируется отделом криминалистики.</w:t>
-      </w:r>
-    </w:p>
-    <w:p>
-      <w:pPr>
-        <w:spacing w:before="0" w:after="0" w:line="240" w:lineRule="auto"/>
-        <w:ind w:firstLine="709"/>
-        <w:jc w:val="both"/>
-      </w:pPr>
-      <w:r>
-        <w:rPr>
-          <w:rFonts w:ascii="Times New Roman" w:hAnsi="Times New Roman" w:eastAsia="Times New Roman"/>
-          <w:b w:val="0"/>
-          <w:sz w:val="28"/>
-        </w:rPr>
-        <w:t>Организовано взаимодействие со специалистами профильных экспертных учреждений при назначении и производстве судебных экспертиз; следователям направляются рекомендации по совершенствованию практики назначения экспертных исследований, определяются наиболее эффективные виды экспертиз для установления подлежащих доказыванию обстоятельств.</w:t>
+        <w:t>В целях недопущения нарушения сроков предварительного следствия руководители следственных отделов ориентированы на неукоснительное соблюдение требований ст. 6.1 УПК РФ, незамедлительное назначение всех необходимых судебных экспертиз и производство следственных и процессуальных действий, направленных на скорейшее принятие законного и обоснованного решения. В рамках криминалистического сопровождения расследования на первоначальном этапе обсуждается объем необходимых экспертных исследований и конкретные экспертные учреждения; по результатам изучения уголовных дел даются письменные указания в порядке ст. 39 УПК РФ, составляются дополнительные согласованные планы следственных действий и оперативно-розыскных мероприятий, направленные на установление лиц, подлежащих привлечению в качестве обвиняемых. На межведомственных совещаниях при участии органов дознания за истекший период заслушано 29 уголовных дел, по которым даны указания, исполнение которых контролируется отделом криминалистики. Организовано взаимодействие со специалистами профильных экспертных учреждений при назначении и производстве судебных экспертиз; следователям направляются рекомендации по совершенствованию практики назначения экспертных исследований, определяются наиболее эффективные виды экспертиз для установления подлежащих доказыванию обстоятельств.</w:t>
       </w:r>
     </w:p>
     <w:p>
@@ -419,97 +194,7 @@
           <w:b w:val="0"/>
           <w:sz w:val="28"/>
         </w:rPr>
-        <w:t>Комплекс принимаемых мер направлен на недопущение волокиты при расследовании уголовных дел, соблюдение процессуальных сроков предварительного следствия и своевременность назначения судебных экспертиз; работа в данном направлении продолжается.</w:t>
-      </w:r>
-    </w:p>
-    <w:p>
-      <w:pPr>
-        <w:spacing w:before="0" w:after="0" w:line="240" w:lineRule="auto"/>
-        <w:ind w:firstLine="709"/>
-        <w:jc w:val="both"/>
-      </w:pPr>
-      <w:r>
-        <w:rPr>
-          <w:rFonts w:ascii="Times New Roman" w:hAnsi="Times New Roman" w:eastAsia="Times New Roman"/>
-          <w:b/>
-          <w:sz w:val="28"/>
-        </w:rPr>
-        <w:t>6. Об информационных письмах и обобщениях практики по вопросам соблюдения процессуальных сроков.</w:t>
-      </w:r>
-    </w:p>
-    <w:p>
-      <w:pPr>
-        <w:spacing w:before="0" w:after="0" w:line="240" w:lineRule="auto"/>
-        <w:ind w:firstLine="709"/>
-        <w:jc w:val="both"/>
-      </w:pPr>
-      <w:r>
-        <w:rPr>
-          <w:rFonts w:ascii="Times New Roman" w:hAnsi="Times New Roman" w:eastAsia="Times New Roman"/>
-          <w:b w:val="0"/>
-          <w:sz w:val="28"/>
-        </w:rPr>
-        <w:t>В 2023–2026 годах отделом криминалистики в следственные отделы направлялись информационные материалы и рекомендации по вопросам назначения и производства судебных экспертиз, соблюдения разумных сроков предварительного расследования:</w:t>
-      </w:r>
-    </w:p>
-    <w:p>
-      <w:pPr>
-        <w:spacing w:before="0" w:after="0" w:line="240" w:lineRule="auto"/>
-        <w:ind w:firstLine="709"/>
-        <w:jc w:val="both"/>
-      </w:pPr>
-      <w:r>
-        <w:rPr>
-          <w:rFonts w:ascii="Times New Roman" w:hAnsi="Times New Roman" w:eastAsia="Times New Roman"/>
-          <w:b w:val="0"/>
-          <w:sz w:val="28"/>
-        </w:rPr>
-        <w:t>- [указать реквизиты информационного письма (обобщения) по практике назначения судебных экспертиз];</w:t>
-      </w:r>
-    </w:p>
-    <w:p>
-      <w:pPr>
-        <w:spacing w:before="0" w:after="0" w:line="240" w:lineRule="auto"/>
-        <w:ind w:firstLine="709"/>
-        <w:jc w:val="both"/>
-      </w:pPr>
-      <w:r>
-        <w:rPr>
-          <w:rFonts w:ascii="Times New Roman" w:hAnsi="Times New Roman" w:eastAsia="Times New Roman"/>
-          <w:b w:val="0"/>
-          <w:sz w:val="28"/>
-        </w:rPr>
-        <w:t>- [указать реквизиты информационного письма (обобщения) по вопросам соблюдения сроков расследования];</w:t>
-      </w:r>
-    </w:p>
-    <w:p>
-      <w:pPr>
-        <w:spacing w:before="0" w:after="0" w:line="240" w:lineRule="auto"/>
-        <w:ind w:firstLine="709"/>
-        <w:jc w:val="both"/>
-      </w:pPr>
-      <w:r>
-        <w:rPr>
-          <w:rFonts w:ascii="Times New Roman" w:hAnsi="Times New Roman" w:eastAsia="Times New Roman"/>
-          <w:b w:val="0"/>
-          <w:sz w:val="28"/>
-        </w:rPr>
-        <w:t>- [при наличии иных документов – дополнить].</w:t>
-      </w:r>
-    </w:p>
-    <w:p>
-      <w:pPr>
-        <w:spacing w:before="0" w:after="0" w:line="240" w:lineRule="auto"/>
-        <w:ind w:firstLine="709"/>
-        <w:jc w:val="both"/>
-      </w:pPr>
-      <w:r>
-        <w:rPr>
-          <w:rFonts w:ascii="Times New Roman" w:hAnsi="Times New Roman" w:eastAsia="Times New Roman"/>
-          <w:b w:val="0"/>
-          <w:sz w:val="28"/>
-        </w:rPr>
-        <w:t>Копии указанных документов могут быть направлены в адрес УКСО ГСУ.</w:t>
+        <w:t>Информационные письма и обобщения практики, подготовленные отделом криминалистики в 2023–2026 годах и направленные в следственные отделы для использования в работе по вопросам соблюдения процессуальных сроков, в том числе своевременности назначения судебных экспертиз, полноты поставленных перед экспертами вопросов и представления объектов исследования, имеются; их копии могут быть направлены в адрес УКСО ГСУ. (Реквизиты уточнить по журналу; см. пометку в файле с пометками. Раздел «о практике назначения судебных экспертиз» за 2022 и 2023 годы, письма о практике назначения и производства судебных экологических экспертиз за 2024 год и первое полугодие 2026 года — будут дополнительно уточнены по журналу исходящей корреспонденции отдела.)</w:t>
       </w:r>
     </w:p>
     <w:sectPr>

</xml_diff>